<commit_message>
Harden D5 integration and coverage audits
</commit_message>
<xml_diff>
--- a/Project 1 Data Quality Assessment/D5 Topological Role Consistency and Structural Representativeness/outputs/reports/D5_EXPERT_REPORT_v2.4.docx
+++ b/Project 1 Data Quality Assessment/D5 Topological Role Consistency and Structural Representativeness/outputs/reports/D5_EXPERT_REPORT_v2.4.docx
@@ -131,7 +131,7 @@
           <w:color w:val="8B2E2E"/>
           <w:sz w:val="21"/>
         </w:rPr>
-        <w:t>Ordinal topology is author-confirmed and inventory-reconciled. Shared family support yields 8 L3 candidates, while node validation retains 3 final L3 templates. D5_report_score contains 39,648 rows. Swap Top-1 is 0.70 (95% CI 0.57-0.80, n=60), so node-specific hard Veto remains disabled.</w:t>
+        <w:t>Ordinal topology is author-confirmed and inventory-reconciled. Shared family support yields 8 L3 candidates, while node validation retains 3 final L3 templates. D5_report_score contains 39,648 rows. Controlled-perturbation swap Top-1 localization is 0.70 (95% CI 0.57-0.80, n=60), so node-specific hard Veto remains disabled.</w:t>
       </w:r>
     </w:p>
     <w:p>
@@ -1629,7 +1629,7 @@
           <w:color w:val="8B2E2E"/>
           <w:sz w:val="21"/>
         </w:rPr>
-        <w:t>Publication audit: six-fold full refit AUROC 0.967, AUPRC 0.974, Top-1 0.767; local all-scenario Top-2 0.839. Confidence-risk coverage is not monotonic, so confidence is not a calibrated sensor-Veto gate.</w:t>
+        <w:t>Publication audit: six-fold controlled-challenge discrimination AUROC 0.967, AUPRC 0.974, controlled-perturbation Top-1 localization 0.767; local all-scenario Top-2 0.839. Confidence-risk coverage is not monotonic, so confidence is not a calibrated sensor-Veto gate.</w:t>
       </w:r>
     </w:p>
     <w:tbl>
@@ -2362,7 +2362,7 @@
       <w:r>
         <w:drawing>
           <wp:inline xmlns:a="http://schemas.openxmlformats.org/drawingml/2006/main" xmlns:pic="http://schemas.openxmlformats.org/drawingml/2006/picture">
-            <wp:extent cx="5623560" cy="4278211"/>
+            <wp:extent cx="5623560" cy="4854789"/>
             <wp:docPr id="7" name="Picture 7" descr="Figure D5-7 | D4-D5 complementarity and D5 robustness."/>
             <wp:cNvGraphicFramePr>
               <a:graphicFrameLocks noChangeAspect="1"/>
@@ -2383,7 +2383,7 @@
                   <pic:spPr>
                     <a:xfrm>
                       <a:off x="0" y="0"/>
-                      <a:ext cx="5623560" cy="4278211"/>
+                      <a:ext cx="5623560" cy="4854789"/>
                     </a:xfrm>
                     <a:prstGeom prst="rect"/>
                   </pic:spPr>
@@ -2407,6 +2407,116 @@
           <w:sz w:val="17"/>
         </w:rPr>
         <w:t>Figure D5-7 | D4-D5 complementarity and D5 robustness.</w:t>
+      </w:r>
+    </w:p>
+    <w:p>
+      <w:pPr>
+        <w:keepNext/>
+        <w:jc w:val="center"/>
+      </w:pPr>
+      <w:r>
+        <w:drawing>
+          <wp:inline xmlns:a="http://schemas.openxmlformats.org/drawingml/2006/main" xmlns:pic="http://schemas.openxmlformats.org/drawingml/2006/picture">
+            <wp:extent cx="5623560" cy="4230779"/>
+            <wp:docPr id="8" name="Picture 8" descr="Figure D5-8 | Dimension-availability sensitivity of the prototype WW-DQS."/>
+            <wp:cNvGraphicFramePr>
+              <a:graphicFrameLocks noChangeAspect="1"/>
+            </wp:cNvGraphicFramePr>
+            <a:graphic>
+              <a:graphicData uri="http://schemas.openxmlformats.org/drawingml/2006/picture">
+                <pic:pic>
+                  <pic:nvPicPr>
+                    <pic:cNvPr id="0" name="FigD5_8_dimension_availability_sensitivity.png"/>
+                    <pic:cNvPicPr/>
+                  </pic:nvPicPr>
+                  <pic:blipFill>
+                    <a:blip r:embed="rId18"/>
+                    <a:stretch>
+                      <a:fillRect/>
+                    </a:stretch>
+                  </pic:blipFill>
+                  <pic:spPr>
+                    <a:xfrm>
+                      <a:off x="0" y="0"/>
+                      <a:ext cx="5623560" cy="4230779"/>
+                    </a:xfrm>
+                    <a:prstGeom prst="rect"/>
+                  </pic:spPr>
+                </pic:pic>
+              </a:graphicData>
+            </a:graphic>
+          </wp:inline>
+        </w:drawing>
+      </w:r>
+    </w:p>
+    <w:p>
+      <w:pPr>
+        <w:spacing w:after="200"/>
+        <w:jc w:val="center"/>
+      </w:pPr>
+      <w:r>
+        <w:rPr>
+          <w:rFonts w:ascii="Arial" w:hAnsi="Arial" w:eastAsia="Microsoft YaHei"/>
+          <w:i/>
+          <w:color w:val="5F6B73"/>
+          <w:sz w:val="17"/>
+        </w:rPr>
+        <w:t>Figure D5-8 | Dimension-availability sensitivity of the prototype WW-DQS.</w:t>
+      </w:r>
+    </w:p>
+    <w:p>
+      <w:pPr>
+        <w:keepNext/>
+        <w:jc w:val="center"/>
+      </w:pPr>
+      <w:r>
+        <w:drawing>
+          <wp:inline xmlns:a="http://schemas.openxmlformats.org/drawingml/2006/main" xmlns:pic="http://schemas.openxmlformats.org/drawingml/2006/picture">
+            <wp:extent cx="5623560" cy="2510037"/>
+            <wp:docPr id="9" name="Picture 9" descr="Figure D5-9 | Target-influence and support-threshold robustness."/>
+            <wp:cNvGraphicFramePr>
+              <a:graphicFrameLocks noChangeAspect="1"/>
+            </wp:cNvGraphicFramePr>
+            <a:graphic>
+              <a:graphicData uri="http://schemas.openxmlformats.org/drawingml/2006/picture">
+                <pic:pic>
+                  <pic:nvPicPr>
+                    <pic:cNvPr id="0" name="FigD5_9_target_support_robustness.png"/>
+                    <pic:cNvPicPr/>
+                  </pic:nvPicPr>
+                  <pic:blipFill>
+                    <a:blip r:embed="rId19"/>
+                    <a:stretch>
+                      <a:fillRect/>
+                    </a:stretch>
+                  </pic:blipFill>
+                  <pic:spPr>
+                    <a:xfrm>
+                      <a:off x="0" y="0"/>
+                      <a:ext cx="5623560" cy="2510037"/>
+                    </a:xfrm>
+                    <a:prstGeom prst="rect"/>
+                  </pic:spPr>
+                </pic:pic>
+              </a:graphicData>
+            </a:graphic>
+          </wp:inline>
+        </w:drawing>
+      </w:r>
+    </w:p>
+    <w:p>
+      <w:pPr>
+        <w:spacing w:after="200"/>
+        <w:jc w:val="center"/>
+      </w:pPr>
+      <w:r>
+        <w:rPr>
+          <w:rFonts w:ascii="Arial" w:hAnsi="Arial" w:eastAsia="Microsoft YaHei"/>
+          <w:i/>
+          <w:color w:val="5F6B73"/>
+          <w:sz w:val="17"/>
+        </w:rPr>
+        <w:t>Figure D5-9 | Target-influence and support-threshold robustness.</w:t>
       </w:r>
     </w:p>
     <w:p>
@@ -2456,7 +2566,7 @@
           <w:color w:val="25282A"/>
           <w:sz w:val="20"/>
         </w:rPr>
-        <w:t>Swap Top-1 is 0.70 (95% CI 0.57-0.80) versus the 0.80 target.</w:t>
+        <w:t>Controlled-perturbation swap Top-1 localization is 0.70 (95% CI 0.57-0.80) versus the 0.80 target.</w:t>
       </w:r>
     </w:p>
     <w:p>
@@ -2502,7 +2612,7 @@
           <w:color w:val="25282A"/>
           <w:sz w:val="21"/>
         </w:rPr>
-        <w:t>The branch is suitable for final WW-DQS subscore aggregation with claim-specific action gates. Automated plant-control deployment remains outside the present evidence scope.</w:t>
+        <w:t>The D5 score is suitable for coverage-aware WW-DQS aggregation, but cross-dimensional manuscript freezing remains blocked until the exact D4 dependency is current. Automated plant-control deployment remains outside the present evidence scope.</w:t>
       </w:r>
     </w:p>
     <w:p>
@@ -2544,7 +2654,21 @@
           <w:color w:val="25282A"/>
           <w:sz w:val="20"/>
         </w:rPr>
-        <w:t>Raise blocked-holdout Top-1 to at least 0.80 without weakening negative-control FAR.</w:t>
+        <w:t>Raise controlled blocked-holdout Top-1 localization to at least 0.80 without weakening negative-control FAR.</w:t>
+      </w:r>
+    </w:p>
+    <w:p>
+      <w:pPr>
+        <w:pStyle w:val="ListNumber"/>
+        <w:spacing w:after="80"/>
+      </w:pPr>
+      <w:r>
+        <w:rPr>
+          <w:rFonts w:ascii="Arial" w:hAnsi="Arial" w:eastAsia="Microsoft YaHei"/>
+          <w:color w:val="25282A"/>
+          <w:sz w:val="20"/>
+        </w:rPr>
+        <w:t>Report availability-aware and fixed-dimension complete-evidence composites separately.</w:t>
       </w:r>
     </w:p>
     <w:p>
@@ -2600,7 +2724,7 @@
         <w:color w:val="5F6B73"/>
         <w:sz w:val="16"/>
       </w:rPr>
-      <w:t>Generated 2026-08-17 17:51 CST | Scientific aggregation release; automated deployment blocked</w:t>
+      <w:t>Generated 2026-08-18 10:57 CST | Scientific aggregation release; automated deployment blocked</w:t>
     </w:r>
   </w:p>
 </w:ftr>

</xml_diff>

<commit_message>
Bind D5 publication artifacts to frozen D4
</commit_message>
<xml_diff>
--- a/Project 1 Data Quality Assessment/D5 Topological Role Consistency and Structural Representativeness/outputs/reports/D5_EXPERT_REPORT_v2.4.docx
+++ b/Project 1 Data Quality Assessment/D5 Topological Role Consistency and Structural Representativeness/outputs/reports/D5_EXPERT_REPORT_v2.4.docx
@@ -1632,6 +1632,16 @@
         <w:t>Publication audit: six-fold controlled-challenge discrimination AUROC 0.967, AUPRC 0.974, controlled-perturbation Top-1 localization 0.767; local all-scenario Top-2 0.839. Confidence-risk coverage is not monotonic, so confidence is not a calibrated sensor-Veto gate.</w:t>
       </w:r>
     </w:p>
+    <w:p>
+      <w:r>
+        <w:rPr>
+          <w:rFonts w:ascii="Arial" w:hAnsi="Arial" w:eastAsia="Microsoft YaHei"/>
+          <w:color w:val="25282A"/>
+          <w:sz w:val="21"/>
+        </w:rPr>
+        <w:t>D4-D5 Spearman rho is 0.119 for report scores and 0.171 for raw-calculable scores. Report/raw descriptive weak-association rates are 94.7% and 86.4%; only strata with at least six independent 7-d blocks receive bootstrap CIs.</w:t>
+      </w:r>
+    </w:p>
     <w:tbl>
       <w:tblPr>
         <w:tblStyle w:val="TableGrid"/>
@@ -2612,7 +2622,7 @@
           <w:color w:val="25282A"/>
           <w:sz w:val="21"/>
         </w:rPr>
-        <w:t>The D5 score is suitable for coverage-aware WW-DQS aggregation, but cross-dimensional manuscript freezing remains blocked until the exact D4 dependency is current. Automated plant-control deployment remains outside the present evidence scope.</w:t>
+        <w:t>The D5 score is suitable for coverage-aware WW-DQS aggregation. Cross-dimensional manuscript values are current and hash-bound to the frozen D4 artifact. Automated plant-control deployment remains outside the present evidence scope.</w:t>
       </w:r>
     </w:p>
     <w:p>
@@ -2682,7 +2692,7 @@
           <w:color w:val="25282A"/>
           <w:sz w:val="20"/>
         </w:rPr>
-        <w:t>Rerun D4-D5 overlap and ablation analysis after the latest D4 merge before freezing WW-DQS weights.</w:t>
+        <w:t>Rerun the complete D4-D5 overlap and ablation audit whenever the frozen D4 artifact changes.</w:t>
       </w:r>
     </w:p>
     <w:p>
@@ -2724,7 +2734,7 @@
         <w:color w:val="5F6B73"/>
         <w:sz w:val="16"/>
       </w:rPr>
-      <w:t>Generated 2026-08-18 10:57 CST | Scientific aggregation release; automated deployment blocked</w:t>
+      <w:t>Generated 2026-08-18 11:58 CST | Scientific aggregation release; automated deployment blocked</w:t>
     </w:r>
   </w:p>
 </w:ftr>

</xml_diff>